<commit_message>
Add more confidence to TailorMed cover letter
Co-Authored-By: Claude Sonnet 5 <noreply@anthropic.com>
Claude-Session: https://claude.ai/code/session_01HSRCWp7aW7e8XLabgwuwHd
</commit_message>
<xml_diff>
--- a/applications/tailormed-patient-support-advocate/Rotenberg Cover Letter - TailorMed - Patient Support Advocate.docx
+++ b/applications/tailormed-patient-support-advocate/Rotenberg Cover Letter - TailorMed - Patient Support Advocate.docx
@@ -94,7 +94,7 @@
           <w:b w:val="0"/>
           <w:color w:val="1A1A1A"/>
         </w:rPr>
-        <w:t>Patient Support Advocate is about steady, accurate execution on the phone and in the system, not strategy. That's the part of my background I want to point you to directly: four years of heavy-volume outbound calling, followed by a decade in account and customer support, including B2B work with agencies serving healthcare clients.</w:t>
+        <w:t>Patient Support Advocate is about steady, accurate execution on the phone and in the system, not strategy. I've already done the hard part of that twice: four years of heavy-volume outbound calling where I got good enough to keep a team of sales reps' calendars full every week, and a decade since where account accuracy was never optional. Most people applying here are hoping they'll be good at this. I already know I am.</w:t>
       </w:r>
     </w:p>
     <w:p>
@@ -107,7 +107,7 @@
           <w:b w:val="0"/>
           <w:color w:val="1A1A1A"/>
         </w:rPr>
-        <w:t>At Senior Directory I prospected and qualified leads by phone for four years, booking appointments and keeping a steady flow of sales-ready meetings, the same discipline this role asks for on calls to programs and payers. At Birdeye, I sold and supported a reseller network that included agencies focused on healthcare clients, real exposure to how healthcare-adjacent businesses operate, though from the marketing-technology side rather than claims or EMR work directly. Across every role since, keeping client records accurate across CRM systems has been part of the job, not an afterthought.</w:t>
+        <w:t>At Senior Directory I prospected and qualified leads by phone for four years, booking appointments and keeping a steady flow of sales-ready meetings, the same discipline this role asks for on calls to programs and payers. At Birdeye, I sold and supported a reseller network that included agencies focused on healthcare clients, real exposure to how healthcare-adjacent businesses operate, though from the marketing-technology side rather than claims or EMR work directly. Across every role since, keeping client records accurate across CRM systems has been part of the job, and I don't let bad data slip by.</w:t>
       </w:r>
     </w:p>
     <w:p>
@@ -120,7 +120,7 @@
           <w:b w:val="0"/>
           <w:color w:val="1A1A1A"/>
         </w:rPr>
-        <w:t>My last few years have been in more strategic, ownership-level roles. What draws me to this one is squarely the work itself: high-volume, accurate, patient-facing communication is something I've done well, and I'd bring the same discipline here. I'd welcome the conversation.</w:t>
+        <w:t>My last few years have been in more strategic, ownership-level roles, running my own company, in fact. What draws me to this one is squarely the work itself, and I'll be direct about it: you'd be getting someone who's already better at this than the job requires. I'd welcome the conversation.</w:t>
       </w:r>
     </w:p>
     <w:p>

</xml_diff>